<commit_message>
Update The Ripple Effect - IMPLEMENTATION DOCUMENT.docx
</commit_message>
<xml_diff>
--- a/Documentation/The Ripple Effect - IMPLEMENTATION DOCUMENT.docx
+++ b/Documentation/The Ripple Effect - IMPLEMENTATION DOCUMENT.docx
@@ -1,21 +1,7 @@
 
 <file path=word/document.xml><?xml version="1.0" encoding="utf-8"?>
-<w:document xmlns:wpc="http://schemas.microsoft.com/office/word/2010/wordprocessingCanvas" xmlns:cx="http://schemas.microsoft.com/office/drawing/2014/chartex" xmlns:cx1="http://schemas.microsoft.com/office/drawing/2015/9/8/chartex" xmlns:cx2="http://schemas.microsoft.com/office/drawing/2015/10/21/chartex" xmlns:cx3="http://schemas.microsoft.com/office/drawing/2016/5/9/chartex" xmlns:cx4="http://schemas.microsoft.com/office/drawing/2016/5/10/chartex" xmlns:cx5="http://schemas.microsoft.com/office/drawing/2016/5/11/chartex" xmlns:cx6="http://schemas.microsoft.com/office/drawing/2016/5/12/chartex" xmlns:cx7="http://schemas.microsoft.com/office/drawing/2016/5/13/chartex" xmlns:cx8="http://schemas.microsoft.com/office/drawing/2016/5/14/chartex" xmlns:mc="http://schemas.openxmlformats.org/markup-compatibility/2006" xmlns:aink="http://schemas.microsoft.com/office/drawing/2016/ink" xmlns:am3d="http://schemas.microsoft.com/office/drawing/2017/model3d" xmlns:o="urn:schemas-microsoft-com:office:office" xmlns:r="http://schemas.openxmlformats.org/officeDocument/2006/relationships" xmlns:m="http://schemas.openxmlformats.org/officeDocument/2006/math" xmlns:v="urn:schemas-microsoft-com:vml" xmlns:wp14="http://schemas.microsoft.com/office/word/2010/wordprocessingDrawing" xmlns:wp="http://schemas.openxmlformats.org/drawingml/2006/wordprocessingDrawing" xmlns:w10="urn:schemas-microsoft-com:office:word" xmlns:w="http://schemas.openxmlformats.org/wordprocessingml/2006/main" xmlns:w14="http://schemas.microsoft.com/office/word/2010/wordml" xmlns:w15="http://schemas.microsoft.com/office/word/2012/wordml" xmlns:w16cid="http://schemas.microsoft.com/office/word/2016/wordml/cid" xmlns:w16se="http://schemas.microsoft.com/office/word/2015/wordml/symex" xmlns:wpg="http://schemas.microsoft.com/office/word/2010/wordprocessingGroup" xmlns:wpi="http://schemas.microsoft.com/office/word/2010/wordprocessingInk" xmlns:wne="http://schemas.microsoft.com/office/word/2006/wordml" xmlns:wps="http://schemas.microsoft.com/office/word/2010/wordprocessingShape" mc:Ignorable="w14 w15 w16se w16cid wp14">
+<w:document xmlns:wpc="http://schemas.microsoft.com/office/word/2010/wordprocessingCanvas" xmlns:cx="http://schemas.microsoft.com/office/drawing/2014/chartex" xmlns:cx1="http://schemas.microsoft.com/office/drawing/2015/9/8/chartex" xmlns:cx2="http://schemas.microsoft.com/office/drawing/2015/10/21/chartex" xmlns:cx3="http://schemas.microsoft.com/office/drawing/2016/5/9/chartex" xmlns:cx4="http://schemas.microsoft.com/office/drawing/2016/5/10/chartex" xmlns:cx5="http://schemas.microsoft.com/office/drawing/2016/5/11/chartex" xmlns:cx6="http://schemas.microsoft.com/office/drawing/2016/5/12/chartex" xmlns:cx7="http://schemas.microsoft.com/office/drawing/2016/5/13/chartex" xmlns:cx8="http://schemas.microsoft.com/office/drawing/2016/5/14/chartex" xmlns:mc="http://schemas.openxmlformats.org/markup-compatibility/2006" xmlns:aink="http://schemas.microsoft.com/office/drawing/2016/ink" xmlns:am3d="http://schemas.microsoft.com/office/drawing/2017/model3d" xmlns:o="urn:schemas-microsoft-com:office:office" xmlns:oel="http://schemas.microsoft.com/office/2019/extlst" xmlns:r="http://schemas.openxmlformats.org/officeDocument/2006/relationships" xmlns:m="http://schemas.openxmlformats.org/officeDocument/2006/math" xmlns:v="urn:schemas-microsoft-com:vml" xmlns:wp14="http://schemas.microsoft.com/office/word/2010/wordprocessingDrawing" xmlns:wp="http://schemas.openxmlformats.org/drawingml/2006/wordprocessingDrawing" xmlns:w10="urn:schemas-microsoft-com:office:word" xmlns:w="http://schemas.openxmlformats.org/wordprocessingml/2006/main" xmlns:w14="http://schemas.microsoft.com/office/word/2010/wordml" xmlns:w15="http://schemas.microsoft.com/office/word/2012/wordml" xmlns:w16cex="http://schemas.microsoft.com/office/word/2018/wordml/cex" xmlns:w16cid="http://schemas.microsoft.com/office/word/2016/wordml/cid" xmlns:w16="http://schemas.microsoft.com/office/word/2018/wordml" xmlns:w16du="http://schemas.microsoft.com/office/word/2023/wordml/word16du" xmlns:w16sdtdh="http://schemas.microsoft.com/office/word/2020/wordml/sdtdatahash" xmlns:w16sdtfl="http://schemas.microsoft.com/office/word/2024/wordml/sdtformatlock" xmlns:w16se="http://schemas.microsoft.com/office/word/2015/wordml/symex" xmlns:wpg="http://schemas.microsoft.com/office/word/2010/wordprocessingGroup" xmlns:wpi="http://schemas.microsoft.com/office/word/2010/wordprocessingInk" xmlns:wne="http://schemas.microsoft.com/office/word/2006/wordml" xmlns:wps="http://schemas.microsoft.com/office/word/2010/wordprocessingShape" mc:Ignorable="w14 w15 w16se w16cid w16 w16cex w16sdtdh w16sdtfl w16du wp14">
   <w:body>
-    <w:p>
-      <w:pPr>
-        <w:rPr>
-          <w:rFonts w:asciiTheme="majorHAnsi" w:eastAsiaTheme="majorEastAsia" w:hAnsiTheme="majorHAnsi" w:cstheme="majorBidi"/>
-          <w:color w:val="2F5496" w:themeColor="accent1" w:themeShade="BF"/>
-          <w:sz w:val="32"/>
-          <w:szCs w:val="32"/>
-          <w:lang w:val="en-US"/>
-        </w:rPr>
-      </w:pPr>
-      <w:r>
-        <w:br w:type="page"/>
-      </w:r>
-    </w:p>
     <w:sdt>
       <w:sdtPr>
         <w:rPr>
@@ -3907,15 +3893,7 @@
       </w:r>
       <w:proofErr w:type="spellEnd"/>
       <w:r>
-        <w:t xml:space="preserve">", </w:t>
-      </w:r>
-      <w:proofErr w:type="spellStart"/>
-      <w:r>
-        <w:t>HOME_POOL_ID</w:t>
-      </w:r>
-      <w:proofErr w:type="spellEnd"/>
-      <w:r>
-        <w:t>): Enforces the architectural rule that events are tied to the active pool (not just the user).</w:t>
+        <w:t>", HOME_POOL_ID): Enforces the architectural rule that events are tied to the active pool (not just the user).</w:t>
       </w:r>
     </w:p>
     <w:p/>
@@ -4027,10 +4005,12 @@
         <w:t xml:space="preserve">", </w:t>
       </w:r>
       <w:proofErr w:type="spellStart"/>
+      <w:proofErr w:type="gramStart"/>
       <w:r>
         <w:t>Query.Direction.ASCENDING</w:t>
       </w:r>
       <w:proofErr w:type="spellEnd"/>
+      <w:proofErr w:type="gramEnd"/>
       <w:r>
         <w:t>): Crucially sorts the events chronologically, ensuring the schedule appears correctly on the user interface.</w:t>
       </w:r>
@@ -4074,8 +4054,6 @@
       <w:r>
         <w:t xml:space="preserve"> or order by</w:t>
       </w:r>
-      <w:bookmarkStart w:id="6" w:name="_GoBack"/>
-      <w:bookmarkEnd w:id="6"/>
       <w:r>
         <w:t xml:space="preserve"> makes this a composite query. This required the manual creation of a Custom Index in the Firebase console, otherwise, the query would fail. This backend step was essential for maintaining query speed and efficiency.</w:t>
       </w:r>
@@ -4111,30 +4089,22 @@
       <w:proofErr w:type="spellEnd"/>
       <w:proofErr w:type="gramEnd"/>
       <w:r>
-        <w:t xml:space="preserve"> </w:t>
+        <w:t xml:space="preserve"> callback. This design ensures the app remains responsive, a key requirement of modern Android development. The retrieved JSON data is automatically mapped to the local </w:t>
       </w:r>
       <w:proofErr w:type="spellStart"/>
       <w:r>
-        <w:t>callback</w:t>
+        <w:t>EventModel</w:t>
       </w:r>
       <w:proofErr w:type="spellEnd"/>
       <w:r>
-        <w:t xml:space="preserve">. This design ensures the app remains responsive, a key requirement of modern Android development. The retrieved JSON data is automatically mapped to the local </w:t>
+        <w:t xml:space="preserve"> Java object using </w:t>
       </w:r>
       <w:proofErr w:type="spellStart"/>
       <w:r>
-        <w:t>EventModel</w:t>
+        <w:t>Firestore's</w:t>
       </w:r>
       <w:proofErr w:type="spellEnd"/>
       <w:r>
-        <w:t xml:space="preserve"> Java object using </w:t>
-      </w:r>
-      <w:proofErr w:type="spellStart"/>
-      <w:r>
-        <w:t>Firestore's</w:t>
-      </w:r>
-      <w:proofErr w:type="spellEnd"/>
-      <w:r>
         <w:t xml:space="preserve"> built-in object mapping capabilities.</w:t>
       </w:r>
     </w:p>
@@ -4163,7 +4133,7 @@
       <w:pPr>
         <w:pStyle w:val="Heading1"/>
       </w:pPr>
-      <w:bookmarkStart w:id="7" w:name="_Toc211497666"/>
+      <w:bookmarkStart w:id="6" w:name="_Toc211497666"/>
       <w:r>
         <w:lastRenderedPageBreak/>
         <w:t>1.</w:t>
@@ -4174,7 +4144,7 @@
       <w:r>
         <w:t xml:space="preserve"> Source code references</w:t>
       </w:r>
-      <w:bookmarkEnd w:id="7"/>
+      <w:bookmarkEnd w:id="6"/>
     </w:p>
     <w:p>
       <w:pPr>
@@ -4235,17 +4205,97 @@
           <w:lang w:val="en-US"/>
         </w:rPr>
       </w:pPr>
-      <w:bookmarkStart w:id="8" w:name="_Toc211497667"/>
+      <w:bookmarkStart w:id="7" w:name="_Toc211497667"/>
       <w:r>
         <w:rPr>
           <w:lang w:val="en-US"/>
         </w:rPr>
         <w:t>1.3.1 Implementing a Fragment-to-Fragment Communication Pattern</w:t>
       </w:r>
+      <w:bookmarkEnd w:id="7"/>
+    </w:p>
+    <w:p>
+      <w:pPr>
+        <w:rPr>
+          <w:lang w:val="en-US"/>
+        </w:rPr>
+      </w:pPr>
+    </w:p>
+    <w:p>
+      <w:pPr>
+        <w:pStyle w:val="Heading3"/>
+        <w:rPr>
+          <w:lang w:val="en-US"/>
+        </w:rPr>
+      </w:pPr>
+      <w:bookmarkStart w:id="8" w:name="_Toc211497668"/>
+      <w:r>
+        <w:rPr>
+          <w:lang w:val="en-US"/>
+        </w:rPr>
+        <w:t>Description</w:t>
+      </w:r>
       <w:bookmarkEnd w:id="8"/>
     </w:p>
     <w:p>
       <w:pPr>
+        <w:jc w:val="both"/>
+        <w:rPr>
+          <w:lang w:val="en-US"/>
+        </w:rPr>
+      </w:pPr>
+      <w:r>
+        <w:rPr>
+          <w:lang w:val="en-US"/>
+        </w:rPr>
+        <w:t xml:space="preserve">In modern Android development, the legacy practice of communicating between Fragments using interfaces implemented by the parent Activity is replaced by the official </w:t>
+      </w:r>
+      <w:proofErr w:type="spellStart"/>
+      <w:r>
+        <w:rPr>
+          <w:lang w:val="en-US"/>
+        </w:rPr>
+        <w:t>FragmentResultListener</w:t>
+      </w:r>
+      <w:proofErr w:type="spellEnd"/>
+      <w:r>
+        <w:rPr>
+          <w:lang w:val="en-US"/>
+        </w:rPr>
+        <w:t xml:space="preserve"> API. This mechanism, used to pass data such as confirmation flags or IDs between the </w:t>
+      </w:r>
+      <w:proofErr w:type="spellStart"/>
+      <w:r>
+        <w:rPr>
+          <w:lang w:val="en-US"/>
+        </w:rPr>
+        <w:t>PO_AddEvent</w:t>
+      </w:r>
+      <w:proofErr w:type="spellEnd"/>
+      <w:r>
+        <w:rPr>
+          <w:lang w:val="en-US"/>
+        </w:rPr>
+        <w:t xml:space="preserve"> and </w:t>
+      </w:r>
+      <w:proofErr w:type="spellStart"/>
+      <w:r>
+        <w:rPr>
+          <w:lang w:val="en-US"/>
+        </w:rPr>
+        <w:t>PO_Calendar</w:t>
+      </w:r>
+      <w:proofErr w:type="spellEnd"/>
+      <w:r>
+        <w:rPr>
+          <w:lang w:val="en-US"/>
+        </w:rPr>
+        <w:t xml:space="preserve"> Fragments, is required for reliable, lifecycle-aware communication.</w:t>
+      </w:r>
+    </w:p>
+    <w:p>
+      <w:pPr>
+        <w:jc w:val="both"/>
         <w:rPr>
           <w:lang w:val="en-US"/>
         </w:rPr>
@@ -4258,94 +4308,14 @@
           <w:lang w:val="en-US"/>
         </w:rPr>
       </w:pPr>
-      <w:bookmarkStart w:id="9" w:name="_Toc211497668"/>
-      <w:r>
-        <w:rPr>
-          <w:lang w:val="en-US"/>
-        </w:rPr>
-        <w:t>Description</w:t>
+      <w:bookmarkStart w:id="9" w:name="_Toc211497669"/>
+      <w:r>
+        <w:rPr>
+          <w:lang w:val="en-US"/>
+        </w:rPr>
+        <w:t>Usage</w:t>
       </w:r>
       <w:bookmarkEnd w:id="9"/>
-    </w:p>
-    <w:p>
-      <w:pPr>
-        <w:jc w:val="both"/>
-        <w:rPr>
-          <w:lang w:val="en-US"/>
-        </w:rPr>
-      </w:pPr>
-      <w:r>
-        <w:rPr>
-          <w:lang w:val="en-US"/>
-        </w:rPr>
-        <w:t xml:space="preserve">In modern Android development, the legacy practice of communicating between Fragments using interfaces implemented by the parent Activity is replaced by the official </w:t>
-      </w:r>
-      <w:proofErr w:type="spellStart"/>
-      <w:r>
-        <w:rPr>
-          <w:lang w:val="en-US"/>
-        </w:rPr>
-        <w:t>FragmentResultListener</w:t>
-      </w:r>
-      <w:proofErr w:type="spellEnd"/>
-      <w:r>
-        <w:rPr>
-          <w:lang w:val="en-US"/>
-        </w:rPr>
-        <w:t xml:space="preserve"> API. This mechanism, used to pass data such as confirmation flags or IDs between the </w:t>
-      </w:r>
-      <w:proofErr w:type="spellStart"/>
-      <w:r>
-        <w:rPr>
-          <w:lang w:val="en-US"/>
-        </w:rPr>
-        <w:t>PO_AddEvent</w:t>
-      </w:r>
-      <w:proofErr w:type="spellEnd"/>
-      <w:r>
-        <w:rPr>
-          <w:lang w:val="en-US"/>
-        </w:rPr>
-        <w:t xml:space="preserve"> and </w:t>
-      </w:r>
-      <w:proofErr w:type="spellStart"/>
-      <w:r>
-        <w:rPr>
-          <w:lang w:val="en-US"/>
-        </w:rPr>
-        <w:t>PO_Calendar</w:t>
-      </w:r>
-      <w:proofErr w:type="spellEnd"/>
-      <w:r>
-        <w:rPr>
-          <w:lang w:val="en-US"/>
-        </w:rPr>
-        <w:t xml:space="preserve"> Fragments, is required for reliable, lifecycle-aware communication.</w:t>
-      </w:r>
-    </w:p>
-    <w:p>
-      <w:pPr>
-        <w:jc w:val="both"/>
-        <w:rPr>
-          <w:lang w:val="en-US"/>
-        </w:rPr>
-      </w:pPr>
-    </w:p>
-    <w:p>
-      <w:pPr>
-        <w:pStyle w:val="Heading3"/>
-        <w:rPr>
-          <w:lang w:val="en-US"/>
-        </w:rPr>
-      </w:pPr>
-      <w:bookmarkStart w:id="10" w:name="_Toc211497669"/>
-      <w:r>
-        <w:rPr>
-          <w:lang w:val="en-US"/>
-        </w:rPr>
-        <w:t>Usage</w:t>
-      </w:r>
-      <w:bookmarkEnd w:id="10"/>
     </w:p>
     <w:p>
       <w:pPr>
@@ -4398,14 +4368,14 @@
           <w:lang w:val="en-US"/>
         </w:rPr>
       </w:pPr>
-      <w:bookmarkStart w:id="11" w:name="_Toc211497670"/>
+      <w:bookmarkStart w:id="10" w:name="_Toc211497670"/>
       <w:r>
         <w:rPr>
           <w:lang w:val="en-US"/>
         </w:rPr>
         <w:t>Reference</w:t>
       </w:r>
-      <w:bookmarkEnd w:id="11"/>
+      <w:bookmarkEnd w:id="10"/>
     </w:p>
     <w:p>
       <w:pPr>
@@ -4445,7 +4415,7 @@
           <w:lang w:val="en-US"/>
         </w:rPr>
       </w:pPr>
-      <w:bookmarkStart w:id="12" w:name="_Toc211497671"/>
+      <w:bookmarkStart w:id="11" w:name="_Toc211497671"/>
       <w:r>
         <w:rPr>
           <w:lang w:val="en-US"/>
@@ -4459,31 +4429,31 @@
         </w:rPr>
         <w:t>Firestore</w:t>
       </w:r>
+      <w:bookmarkEnd w:id="11"/>
+      <w:proofErr w:type="spellEnd"/>
+    </w:p>
+    <w:p>
+      <w:pPr>
+        <w:rPr>
+          <w:lang w:val="en-US"/>
+        </w:rPr>
+      </w:pPr>
+    </w:p>
+    <w:p>
+      <w:pPr>
+        <w:pStyle w:val="Heading3"/>
+        <w:rPr>
+          <w:lang w:val="en-US"/>
+        </w:rPr>
+      </w:pPr>
+      <w:bookmarkStart w:id="12" w:name="_Toc211497672"/>
+      <w:r>
+        <w:rPr>
+          <w:lang w:val="en-US"/>
+        </w:rPr>
+        <w:t>Description</w:t>
+      </w:r>
       <w:bookmarkEnd w:id="12"/>
-      <w:proofErr w:type="spellEnd"/>
-    </w:p>
-    <w:p>
-      <w:pPr>
-        <w:rPr>
-          <w:lang w:val="en-US"/>
-        </w:rPr>
-      </w:pPr>
-    </w:p>
-    <w:p>
-      <w:pPr>
-        <w:pStyle w:val="Heading3"/>
-        <w:rPr>
-          <w:lang w:val="en-US"/>
-        </w:rPr>
-      </w:pPr>
-      <w:bookmarkStart w:id="13" w:name="_Toc211497672"/>
-      <w:r>
-        <w:rPr>
-          <w:lang w:val="en-US"/>
-        </w:rPr>
-        <w:t>Description</w:t>
-      </w:r>
-      <w:bookmarkEnd w:id="13"/>
     </w:p>
     <w:p>
       <w:pPr>
@@ -4535,6 +4505,7 @@
         <w:t xml:space="preserve">) and </w:t>
       </w:r>
       <w:proofErr w:type="spellStart"/>
+      <w:proofErr w:type="gramStart"/>
       <w:r>
         <w:rPr>
           <w:lang w:val="en-US"/>
@@ -4546,7 +4517,14 @@
         <w:rPr>
           <w:lang w:val="en-US"/>
         </w:rPr>
-        <w:t xml:space="preserve">() on the </w:t>
+        <w:t>(</w:t>
+      </w:r>
+      <w:proofErr w:type="gramEnd"/>
+      <w:r>
+        <w:rPr>
+          <w:lang w:val="en-US"/>
+        </w:rPr>
+        <w:t xml:space="preserve">) on the </w:t>
       </w:r>
       <w:proofErr w:type="spellStart"/>
       <w:r>
@@ -4561,72 +4539,6 @@
           <w:lang w:val="en-US"/>
         </w:rPr>
         <w:t xml:space="preserve"> field, combined with the </w:t>
-      </w:r>
-      <w:proofErr w:type="spellStart"/>
-      <w:r>
-        <w:rPr>
-          <w:lang w:val="en-US"/>
-        </w:rPr>
-        <w:t>orderBy</w:t>
-      </w:r>
-      <w:proofErr w:type="spellEnd"/>
-      <w:r>
-        <w:rPr>
-          <w:lang w:val="en-US"/>
-        </w:rPr>
-        <w:t xml:space="preserve">() clause, is an advanced querying pattern essential for scheduling systems. This requires precise handling of </w:t>
-      </w:r>
-      <w:proofErr w:type="spellStart"/>
-      <w:r>
-        <w:rPr>
-          <w:lang w:val="en-US"/>
-        </w:rPr>
-        <w:t>System.currentTimeMillis</w:t>
-      </w:r>
-      <w:proofErr w:type="spellEnd"/>
-      <w:r>
-        <w:rPr>
-          <w:lang w:val="en-US"/>
-        </w:rPr>
-        <w:t>() timestamps and the creation of specific backend indexes to run successfully and maintain performance.</w:t>
-      </w:r>
-    </w:p>
-    <w:p>
-      <w:pPr>
-        <w:jc w:val="both"/>
-        <w:rPr>
-          <w:lang w:val="en-US"/>
-        </w:rPr>
-      </w:pPr>
-    </w:p>
-    <w:p>
-      <w:pPr>
-        <w:pStyle w:val="Heading3"/>
-        <w:rPr>
-          <w:lang w:val="en-US"/>
-        </w:rPr>
-      </w:pPr>
-      <w:bookmarkStart w:id="14" w:name="_Toc211497673"/>
-      <w:r>
-        <w:rPr>
-          <w:lang w:val="en-US"/>
-        </w:rPr>
-        <w:t>Usage</w:t>
-      </w:r>
-      <w:bookmarkEnd w:id="14"/>
-    </w:p>
-    <w:p>
-      <w:pPr>
-        <w:jc w:val="both"/>
-        <w:rPr>
-          <w:lang w:val="en-US"/>
-        </w:rPr>
-      </w:pPr>
-      <w:r>
-        <w:rPr>
-          <w:lang w:val="en-US"/>
-        </w:rPr>
-        <w:t>PO_Calendar.java (</w:t>
       </w:r>
       <w:proofErr w:type="spellStart"/>
       <w:proofErr w:type="gramStart"/>
@@ -4634,6 +4546,80 @@
         <w:rPr>
           <w:lang w:val="en-US"/>
         </w:rPr>
+        <w:t>orderBy</w:t>
+      </w:r>
+      <w:proofErr w:type="spellEnd"/>
+      <w:r>
+        <w:rPr>
+          <w:lang w:val="en-US"/>
+        </w:rPr>
+        <w:t>(</w:t>
+      </w:r>
+      <w:proofErr w:type="gramEnd"/>
+      <w:r>
+        <w:rPr>
+          <w:lang w:val="en-US"/>
+        </w:rPr>
+        <w:t xml:space="preserve">) clause, is an advanced querying pattern essential for scheduling systems. This requires precise handling of </w:t>
+      </w:r>
+      <w:proofErr w:type="spellStart"/>
+      <w:r>
+        <w:rPr>
+          <w:lang w:val="en-US"/>
+        </w:rPr>
+        <w:t>System.currentTimeMillis</w:t>
+      </w:r>
+      <w:proofErr w:type="spellEnd"/>
+      <w:r>
+        <w:rPr>
+          <w:lang w:val="en-US"/>
+        </w:rPr>
+        <w:t>() timestamps and the creation of specific backend indexes to run successfully and maintain performance.</w:t>
+      </w:r>
+    </w:p>
+    <w:p>
+      <w:pPr>
+        <w:jc w:val="both"/>
+        <w:rPr>
+          <w:lang w:val="en-US"/>
+        </w:rPr>
+      </w:pPr>
+    </w:p>
+    <w:p>
+      <w:pPr>
+        <w:pStyle w:val="Heading3"/>
+        <w:rPr>
+          <w:lang w:val="en-US"/>
+        </w:rPr>
+      </w:pPr>
+      <w:bookmarkStart w:id="13" w:name="_Toc211497673"/>
+      <w:r>
+        <w:rPr>
+          <w:lang w:val="en-US"/>
+        </w:rPr>
+        <w:t>Usage</w:t>
+      </w:r>
+      <w:bookmarkEnd w:id="13"/>
+    </w:p>
+    <w:p>
+      <w:pPr>
+        <w:jc w:val="both"/>
+        <w:rPr>
+          <w:lang w:val="en-US"/>
+        </w:rPr>
+      </w:pPr>
+      <w:r>
+        <w:rPr>
+          <w:lang w:val="en-US"/>
+        </w:rPr>
+        <w:t>PO_Calendar.java (</w:t>
+      </w:r>
+      <w:proofErr w:type="spellStart"/>
+      <w:proofErr w:type="gramStart"/>
+      <w:r>
+        <w:rPr>
+          <w:lang w:val="en-US"/>
+        </w:rPr>
         <w:t>loadEventsForSelectedDate</w:t>
       </w:r>
       <w:proofErr w:type="spellEnd"/>
@@ -4666,14 +4652,14 @@
           <w:lang w:val="en-US"/>
         </w:rPr>
       </w:pPr>
-      <w:bookmarkStart w:id="15" w:name="_Toc211497674"/>
+      <w:bookmarkStart w:id="14" w:name="_Toc211497674"/>
       <w:r>
         <w:rPr>
           <w:lang w:val="en-US"/>
         </w:rPr>
         <w:t>Reference</w:t>
       </w:r>
-      <w:bookmarkEnd w:id="15"/>
+      <w:bookmarkEnd w:id="14"/>
     </w:p>
     <w:p>
       <w:pPr>
@@ -4767,7 +4753,7 @@
           <w:lang w:val="en-US"/>
         </w:rPr>
       </w:pPr>
-      <w:bookmarkStart w:id="16" w:name="_Toc211497675"/>
+      <w:bookmarkStart w:id="15" w:name="_Toc211497675"/>
       <w:r>
         <w:rPr>
           <w:lang w:val="en-US"/>
@@ -4787,7 +4773,7 @@
         </w:rPr>
         <w:t xml:space="preserve"> Problems encountered</w:t>
       </w:r>
-      <w:bookmarkEnd w:id="16"/>
+      <w:bookmarkEnd w:id="15"/>
       <w:r>
         <w:rPr>
           <w:lang w:val="en-US"/>
@@ -4829,7 +4815,7 @@
           <w:lang w:val="en-US"/>
         </w:rPr>
       </w:pPr>
-      <w:bookmarkStart w:id="17" w:name="_Toc211497676"/>
+      <w:bookmarkStart w:id="16" w:name="_Toc211497676"/>
       <w:r>
         <w:rPr>
           <w:lang w:val="en-US"/>
@@ -4851,7 +4837,7 @@
       <w:r>
         <w:t>Integrating a Functional and Customizable Calendar System</w:t>
       </w:r>
-      <w:bookmarkEnd w:id="17"/>
+      <w:bookmarkEnd w:id="16"/>
     </w:p>
     <w:p>
       <w:pPr>
@@ -4870,7 +4856,7 @@
           <w:lang w:val="en-US"/>
         </w:rPr>
       </w:pPr>
-      <w:bookmarkStart w:id="18" w:name="_Toc211497677"/>
+      <w:bookmarkStart w:id="17" w:name="_Toc211497677"/>
       <w:r>
         <w:rPr>
           <w:i/>
@@ -4879,7 +4865,7 @@
         </w:rPr>
         <w:t>Problem</w:t>
       </w:r>
-      <w:bookmarkEnd w:id="18"/>
+      <w:bookmarkEnd w:id="17"/>
     </w:p>
     <w:p>
       <w:pPr>
@@ -4903,7 +4889,7 @@
           <w:lang w:val="en-US"/>
         </w:rPr>
       </w:pPr>
-      <w:bookmarkStart w:id="19" w:name="_Toc211497678"/>
+      <w:bookmarkStart w:id="18" w:name="_Toc211497678"/>
       <w:r>
         <w:rPr>
           <w:i/>
@@ -4911,85 +4897,85 @@
         </w:rPr>
         <w:t>Solution</w:t>
       </w:r>
+      <w:bookmarkEnd w:id="18"/>
+    </w:p>
+    <w:p>
+      <w:pPr>
+        <w:jc w:val="both"/>
+        <w:rPr>
+          <w:lang w:val="en-US"/>
+        </w:rPr>
+      </w:pPr>
+      <w:r>
+        <w:rPr>
+          <w:lang w:val="en-US"/>
+        </w:rPr>
+        <w:t xml:space="preserve">We resolved this by abandoning external libraries and leveraging the built-in Android </w:t>
+      </w:r>
+      <w:proofErr w:type="spellStart"/>
+      <w:r>
+        <w:rPr>
+          <w:lang w:val="en-US"/>
+        </w:rPr>
+        <w:t>CalendarView</w:t>
+      </w:r>
+      <w:proofErr w:type="spellEnd"/>
+      <w:r>
+        <w:rPr>
+          <w:lang w:val="en-US"/>
+        </w:rPr>
+        <w:t xml:space="preserve"> component. This component provided the basic month view. Crucially, we custom-wrote all the related logic, including the time manipulation, database querying (as seen in Section 1.2), and the display of the events list (</w:t>
+      </w:r>
+      <w:proofErr w:type="spellStart"/>
+      <w:r>
+        <w:rPr>
+          <w:lang w:val="en-US"/>
+        </w:rPr>
+        <w:t>RecyclerView</w:t>
+      </w:r>
+      <w:proofErr w:type="spellEnd"/>
+      <w:r>
+        <w:rPr>
+          <w:lang w:val="en-US"/>
+        </w:rPr>
+        <w:t>). This allowed us to maintain full control over the UI/UX and integrate our complex data architecture seamlessly.</w:t>
+      </w:r>
+    </w:p>
+    <w:p>
+      <w:pPr>
+        <w:jc w:val="both"/>
+        <w:rPr>
+          <w:lang w:val="en-US"/>
+        </w:rPr>
+      </w:pPr>
+    </w:p>
+    <w:p>
+      <w:pPr>
+        <w:pStyle w:val="Heading2"/>
+      </w:pPr>
+      <w:bookmarkStart w:id="19" w:name="_Toc211497679"/>
+      <w:r>
+        <w:rPr>
+          <w:lang w:val="en-US"/>
+        </w:rPr>
+        <w:t>1.4.</w:t>
+      </w:r>
+      <w:r>
+        <w:rPr>
+          <w:lang w:val="en-US"/>
+        </w:rPr>
+        <w:t>2</w:t>
+      </w:r>
+      <w:r>
+        <w:rPr>
+          <w:lang w:val="en-US"/>
+        </w:rPr>
+        <w:t xml:space="preserve"> </w:t>
+      </w:r>
+      <w:r>
+        <w:t>Managing Git Version Control and Merge Conflicts</w:t>
+      </w:r>
       <w:bookmarkEnd w:id="19"/>
-    </w:p>
-    <w:p>
-      <w:pPr>
-        <w:jc w:val="both"/>
-        <w:rPr>
-          <w:lang w:val="en-US"/>
-        </w:rPr>
-      </w:pPr>
-      <w:r>
-        <w:rPr>
-          <w:lang w:val="en-US"/>
-        </w:rPr>
-        <w:t xml:space="preserve">We resolved this by abandoning external libraries and leveraging the built-in Android </w:t>
-      </w:r>
-      <w:proofErr w:type="spellStart"/>
-      <w:r>
-        <w:rPr>
-          <w:lang w:val="en-US"/>
-        </w:rPr>
-        <w:t>CalendarView</w:t>
-      </w:r>
-      <w:proofErr w:type="spellEnd"/>
-      <w:r>
-        <w:rPr>
-          <w:lang w:val="en-US"/>
-        </w:rPr>
-        <w:t xml:space="preserve"> component. This component provided the basic month view. Crucially, we custom-wrote all the related logic, including the time manipulation, database querying (as seen in Section 1.2), and the display of the events list (</w:t>
-      </w:r>
-      <w:proofErr w:type="spellStart"/>
-      <w:r>
-        <w:rPr>
-          <w:lang w:val="en-US"/>
-        </w:rPr>
-        <w:t>RecyclerView</w:t>
-      </w:r>
-      <w:proofErr w:type="spellEnd"/>
-      <w:r>
-        <w:rPr>
-          <w:lang w:val="en-US"/>
-        </w:rPr>
-        <w:t>). This allowed us to maintain full control over the UI/UX and integrate our complex data architecture seamlessly.</w:t>
-      </w:r>
-    </w:p>
-    <w:p>
-      <w:pPr>
-        <w:jc w:val="both"/>
-        <w:rPr>
-          <w:lang w:val="en-US"/>
-        </w:rPr>
-      </w:pPr>
-    </w:p>
-    <w:p>
-      <w:pPr>
-        <w:pStyle w:val="Heading2"/>
-      </w:pPr>
-      <w:bookmarkStart w:id="20" w:name="_Toc211497679"/>
-      <w:r>
-        <w:rPr>
-          <w:lang w:val="en-US"/>
-        </w:rPr>
-        <w:t>1.4.</w:t>
-      </w:r>
-      <w:r>
-        <w:rPr>
-          <w:lang w:val="en-US"/>
-        </w:rPr>
-        <w:t>2</w:t>
-      </w:r>
-      <w:r>
-        <w:rPr>
-          <w:lang w:val="en-US"/>
-        </w:rPr>
-        <w:t xml:space="preserve"> </w:t>
-      </w:r>
-      <w:r>
-        <w:t>Managing Git Version Control and Merge Conflicts</w:t>
-      </w:r>
-      <w:bookmarkEnd w:id="20"/>
     </w:p>
     <w:p/>
     <w:p>
@@ -5001,7 +4987,7 @@
           <w:lang w:val="en-US"/>
         </w:rPr>
       </w:pPr>
-      <w:bookmarkStart w:id="21" w:name="_Toc211497680"/>
+      <w:bookmarkStart w:id="20" w:name="_Toc211497680"/>
       <w:r>
         <w:rPr>
           <w:i/>
@@ -5010,7 +4996,7 @@
         </w:rPr>
         <w:t>Problem</w:t>
       </w:r>
-      <w:bookmarkEnd w:id="21"/>
+      <w:bookmarkEnd w:id="20"/>
     </w:p>
     <w:p>
       <w:pPr>
@@ -5046,7 +5032,7 @@
           <w:lang w:val="en-US"/>
         </w:rPr>
       </w:pPr>
-      <w:bookmarkStart w:id="22" w:name="_Toc211497681"/>
+      <w:bookmarkStart w:id="21" w:name="_Toc211497681"/>
       <w:r>
         <w:rPr>
           <w:i/>
@@ -5054,7 +5040,7 @@
         </w:rPr>
         <w:t>Solution</w:t>
       </w:r>
-      <w:bookmarkEnd w:id="22"/>
+      <w:bookmarkEnd w:id="21"/>
     </w:p>
     <w:p>
       <w:pPr>
@@ -5098,7 +5084,7 @@
       <w:pPr>
         <w:pStyle w:val="Heading2"/>
       </w:pPr>
-      <w:bookmarkStart w:id="23" w:name="_Toc211497682"/>
+      <w:bookmarkStart w:id="22" w:name="_Toc211497682"/>
       <w:r>
         <w:rPr>
           <w:lang w:val="en-US"/>
@@ -5121,7 +5107,7 @@
       <w:r>
         <w:t>Data Dependency and Implementation of Offline Capabilities</w:t>
       </w:r>
-      <w:bookmarkEnd w:id="23"/>
+      <w:bookmarkEnd w:id="22"/>
     </w:p>
     <w:p>
       <w:pPr>
@@ -5139,7 +5125,7 @@
           <w:lang w:val="en-US"/>
         </w:rPr>
       </w:pPr>
-      <w:bookmarkStart w:id="24" w:name="_Toc211497683"/>
+      <w:bookmarkStart w:id="23" w:name="_Toc211497683"/>
       <w:r>
         <w:rPr>
           <w:i/>
@@ -5148,7 +5134,7 @@
         </w:rPr>
         <w:t>Problem</w:t>
       </w:r>
-      <w:bookmarkEnd w:id="24"/>
+      <w:bookmarkEnd w:id="23"/>
     </w:p>
     <w:p>
       <w:r>
@@ -5204,7 +5190,7 @@
           <w:lang w:val="en-US"/>
         </w:rPr>
       </w:pPr>
-      <w:bookmarkStart w:id="25" w:name="_Toc211497684"/>
+      <w:bookmarkStart w:id="24" w:name="_Toc211497684"/>
       <w:r>
         <w:rPr>
           <w:i/>
@@ -5212,73 +5198,73 @@
         </w:rPr>
         <w:t>Solution</w:t>
       </w:r>
+      <w:bookmarkEnd w:id="24"/>
+    </w:p>
+    <w:p>
+      <w:r>
+        <w:t xml:space="preserve">Our current strategy focuses on </w:t>
+      </w:r>
+      <w:r>
+        <w:rPr>
+          <w:bCs/>
+        </w:rPr>
+        <w:t>managing cache dependency</w:t>
+      </w:r>
+      <w:r>
+        <w:t>.</w:t>
+      </w:r>
+      <w:r>
+        <w:t xml:space="preserve"> We utilize </w:t>
+      </w:r>
+      <w:proofErr w:type="spellStart"/>
+      <w:r>
+        <w:t>Firestore's</w:t>
+      </w:r>
+      <w:proofErr w:type="spellEnd"/>
+      <w:r>
+        <w:t xml:space="preserve"> built-in offline capabilities, which allow the app to cache data it has recently accessed while online. This provides limited offline functionality. For future iterations, the goal is to implement a more comprehensive cache-management layer</w:t>
+      </w:r>
+      <w:r>
+        <w:t xml:space="preserve"> </w:t>
+      </w:r>
+      <w:r>
+        <w:t xml:space="preserve">potentially using the </w:t>
+      </w:r>
+      <w:r>
+        <w:rPr>
+          <w:bCs/>
+        </w:rPr>
+        <w:t>Repository pattern</w:t>
+      </w:r>
+      <w:r>
+        <w:t xml:space="preserve"> </w:t>
+      </w:r>
+      <w:r>
+        <w:t>to actively store and serve data like event logs during offline periods, with synchronization only occurring when connectivity is restored.</w:t>
+      </w:r>
+    </w:p>
+    <w:p/>
+    <w:p>
+      <w:pPr>
+        <w:pStyle w:val="Heading2"/>
+      </w:pPr>
+      <w:bookmarkStart w:id="25" w:name="_Toc211497685"/>
+      <w:r>
+        <w:rPr>
+          <w:lang w:val="en-US"/>
+        </w:rPr>
+        <w:t>1.4.</w:t>
+      </w:r>
+      <w:r>
+        <w:rPr>
+          <w:lang w:val="en-US"/>
+        </w:rPr>
+        <w:t xml:space="preserve">4 </w:t>
+      </w:r>
+      <w:r>
+        <w:t>Storing User Images and Overcoming Firebase Storage Limits</w:t>
+      </w:r>
       <w:bookmarkEnd w:id="25"/>
-    </w:p>
-    <w:p>
-      <w:r>
-        <w:t xml:space="preserve">Our current strategy focuses on </w:t>
-      </w:r>
-      <w:r>
-        <w:rPr>
-          <w:bCs/>
-        </w:rPr>
-        <w:t>managing cache dependency</w:t>
-      </w:r>
-      <w:r>
-        <w:t>.</w:t>
-      </w:r>
-      <w:r>
-        <w:t xml:space="preserve"> We utilize </w:t>
-      </w:r>
-      <w:proofErr w:type="spellStart"/>
-      <w:r>
-        <w:t>Firestore's</w:t>
-      </w:r>
-      <w:proofErr w:type="spellEnd"/>
-      <w:r>
-        <w:t xml:space="preserve"> built-in offline capabilities, which allow the app to cache data it has recently accessed while online. This provides limited offline functionality. For future iterations, the goal is to implement a more comprehensive cache-management layer</w:t>
-      </w:r>
-      <w:r>
-        <w:t xml:space="preserve"> </w:t>
-      </w:r>
-      <w:r>
-        <w:t xml:space="preserve">potentially using the </w:t>
-      </w:r>
-      <w:r>
-        <w:rPr>
-          <w:bCs/>
-        </w:rPr>
-        <w:t>Repository pattern</w:t>
-      </w:r>
-      <w:r>
-        <w:t xml:space="preserve"> </w:t>
-      </w:r>
-      <w:r>
-        <w:t>to actively store and serve data like event logs during offline periods, with synchronization only occurring when connectivity is restored.</w:t>
-      </w:r>
-    </w:p>
-    <w:p/>
-    <w:p>
-      <w:pPr>
-        <w:pStyle w:val="Heading2"/>
-      </w:pPr>
-      <w:bookmarkStart w:id="26" w:name="_Toc211497685"/>
-      <w:r>
-        <w:rPr>
-          <w:lang w:val="en-US"/>
-        </w:rPr>
-        <w:t>1.4.</w:t>
-      </w:r>
-      <w:r>
-        <w:rPr>
-          <w:lang w:val="en-US"/>
-        </w:rPr>
-        <w:t xml:space="preserve">4 </w:t>
-      </w:r>
-      <w:r>
-        <w:t>Storing User Images and Overcoming Firebase Storage Limits</w:t>
-      </w:r>
-      <w:bookmarkEnd w:id="26"/>
     </w:p>
     <w:p/>
     <w:p>
@@ -5289,7 +5275,7 @@
           <w:iCs/>
         </w:rPr>
       </w:pPr>
-      <w:bookmarkStart w:id="27" w:name="_Toc211497686"/>
+      <w:bookmarkStart w:id="26" w:name="_Toc211497686"/>
       <w:r>
         <w:rPr>
           <w:i/>
@@ -5297,7 +5283,7 @@
         </w:rPr>
         <w:t>Problem</w:t>
       </w:r>
-      <w:bookmarkEnd w:id="27"/>
+      <w:bookmarkEnd w:id="26"/>
     </w:p>
     <w:p>
       <w:r>
@@ -5333,7 +5319,7 @@
           <w:iCs/>
         </w:rPr>
       </w:pPr>
-      <w:bookmarkStart w:id="28" w:name="_Toc211497687"/>
+      <w:bookmarkStart w:id="27" w:name="_Toc211497687"/>
       <w:r>
         <w:rPr>
           <w:i/>
@@ -5341,7 +5327,7 @@
         </w:rPr>
         <w:t>Solution</w:t>
       </w:r>
-      <w:bookmarkEnd w:id="28"/>
+      <w:bookmarkEnd w:id="27"/>
     </w:p>
     <w:p>
       <w:r>
@@ -5489,7 +5475,7 @@
 </file>
 
 <file path=word/endnotes.xml><?xml version="1.0" encoding="utf-8"?>
-<w:endnotes xmlns:wpc="http://schemas.microsoft.com/office/word/2010/wordprocessingCanvas" xmlns:cx="http://schemas.microsoft.com/office/drawing/2014/chartex" xmlns:cx1="http://schemas.microsoft.com/office/drawing/2015/9/8/chartex" xmlns:cx2="http://schemas.microsoft.com/office/drawing/2015/10/21/chartex" xmlns:cx3="http://schemas.microsoft.com/office/drawing/2016/5/9/chartex" xmlns:cx4="http://schemas.microsoft.com/office/drawing/2016/5/10/chartex" xmlns:cx5="http://schemas.microsoft.com/office/drawing/2016/5/11/chartex" xmlns:cx6="http://schemas.microsoft.com/office/drawing/2016/5/12/chartex" xmlns:cx7="http://schemas.microsoft.com/office/drawing/2016/5/13/chartex" xmlns:cx8="http://schemas.microsoft.com/office/drawing/2016/5/14/chartex" xmlns:mc="http://schemas.openxmlformats.org/markup-compatibility/2006" xmlns:aink="http://schemas.microsoft.com/office/drawing/2016/ink" xmlns:am3d="http://schemas.microsoft.com/office/drawing/2017/model3d" xmlns:o="urn:schemas-microsoft-com:office:office" xmlns:r="http://schemas.openxmlformats.org/officeDocument/2006/relationships" xmlns:m="http://schemas.openxmlformats.org/officeDocument/2006/math" xmlns:v="urn:schemas-microsoft-com:vml" xmlns:wp14="http://schemas.microsoft.com/office/word/2010/wordprocessingDrawing" xmlns:wp="http://schemas.openxmlformats.org/drawingml/2006/wordprocessingDrawing" xmlns:w10="urn:schemas-microsoft-com:office:word" xmlns:w="http://schemas.openxmlformats.org/wordprocessingml/2006/main" xmlns:w14="http://schemas.microsoft.com/office/word/2010/wordml" xmlns:w15="http://schemas.microsoft.com/office/word/2012/wordml" xmlns:w16cid="http://schemas.microsoft.com/office/word/2016/wordml/cid" xmlns:w16se="http://schemas.microsoft.com/office/word/2015/wordml/symex" xmlns:wpg="http://schemas.microsoft.com/office/word/2010/wordprocessingGroup" xmlns:wpi="http://schemas.microsoft.com/office/word/2010/wordprocessingInk" xmlns:wne="http://schemas.microsoft.com/office/word/2006/wordml" xmlns:wps="http://schemas.microsoft.com/office/word/2010/wordprocessingShape" mc:Ignorable="w14 w15 w16se w16cid wp14">
+<w:endnotes xmlns:wpc="http://schemas.microsoft.com/office/word/2010/wordprocessingCanvas" xmlns:cx="http://schemas.microsoft.com/office/drawing/2014/chartex" xmlns:cx1="http://schemas.microsoft.com/office/drawing/2015/9/8/chartex" xmlns:cx2="http://schemas.microsoft.com/office/drawing/2015/10/21/chartex" xmlns:cx3="http://schemas.microsoft.com/office/drawing/2016/5/9/chartex" xmlns:cx4="http://schemas.microsoft.com/office/drawing/2016/5/10/chartex" xmlns:cx5="http://schemas.microsoft.com/office/drawing/2016/5/11/chartex" xmlns:cx6="http://schemas.microsoft.com/office/drawing/2016/5/12/chartex" xmlns:cx7="http://schemas.microsoft.com/office/drawing/2016/5/13/chartex" xmlns:cx8="http://schemas.microsoft.com/office/drawing/2016/5/14/chartex" xmlns:mc="http://schemas.openxmlformats.org/markup-compatibility/2006" xmlns:aink="http://schemas.microsoft.com/office/drawing/2016/ink" xmlns:am3d="http://schemas.microsoft.com/office/drawing/2017/model3d" xmlns:o="urn:schemas-microsoft-com:office:office" xmlns:oel="http://schemas.microsoft.com/office/2019/extlst" xmlns:r="http://schemas.openxmlformats.org/officeDocument/2006/relationships" xmlns:m="http://schemas.openxmlformats.org/officeDocument/2006/math" xmlns:v="urn:schemas-microsoft-com:vml" xmlns:wp14="http://schemas.microsoft.com/office/word/2010/wordprocessingDrawing" xmlns:wp="http://schemas.openxmlformats.org/drawingml/2006/wordprocessingDrawing" xmlns:w10="urn:schemas-microsoft-com:office:word" xmlns:w="http://schemas.openxmlformats.org/wordprocessingml/2006/main" xmlns:w14="http://schemas.microsoft.com/office/word/2010/wordml" xmlns:w15="http://schemas.microsoft.com/office/word/2012/wordml" xmlns:w16cex="http://schemas.microsoft.com/office/word/2018/wordml/cex" xmlns:w16cid="http://schemas.microsoft.com/office/word/2016/wordml/cid" xmlns:w16="http://schemas.microsoft.com/office/word/2018/wordml" xmlns:w16du="http://schemas.microsoft.com/office/word/2023/wordml/word16du" xmlns:w16sdtdh="http://schemas.microsoft.com/office/word/2020/wordml/sdtdatahash" xmlns:w16sdtfl="http://schemas.microsoft.com/office/word/2024/wordml/sdtformatlock" xmlns:w16se="http://schemas.microsoft.com/office/word/2015/wordml/symex" xmlns:wpg="http://schemas.microsoft.com/office/word/2010/wordprocessingGroup" xmlns:wpi="http://schemas.microsoft.com/office/word/2010/wordprocessingInk" xmlns:wne="http://schemas.microsoft.com/office/word/2006/wordml" xmlns:wps="http://schemas.microsoft.com/office/word/2010/wordprocessingShape" mc:Ignorable="w14 w15 w16se w16cid w16 w16cex w16sdtdh w16sdtfl w16du wp14">
   <w:endnote w:type="separator" w:id="-1">
     <w:p>
       <w:r>
@@ -5508,7 +5494,7 @@
 </file>
 
 <file path=word/footer1.xml><?xml version="1.0" encoding="utf-8"?>
-<w:ftr xmlns:wpc="http://schemas.microsoft.com/office/word/2010/wordprocessingCanvas" xmlns:cx="http://schemas.microsoft.com/office/drawing/2014/chartex" xmlns:cx1="http://schemas.microsoft.com/office/drawing/2015/9/8/chartex" xmlns:cx2="http://schemas.microsoft.com/office/drawing/2015/10/21/chartex" xmlns:cx3="http://schemas.microsoft.com/office/drawing/2016/5/9/chartex" xmlns:cx4="http://schemas.microsoft.com/office/drawing/2016/5/10/chartex" xmlns:cx5="http://schemas.microsoft.com/office/drawing/2016/5/11/chartex" xmlns:cx6="http://schemas.microsoft.com/office/drawing/2016/5/12/chartex" xmlns:cx7="http://schemas.microsoft.com/office/drawing/2016/5/13/chartex" xmlns:cx8="http://schemas.microsoft.com/office/drawing/2016/5/14/chartex" xmlns:mc="http://schemas.openxmlformats.org/markup-compatibility/2006" xmlns:aink="http://schemas.microsoft.com/office/drawing/2016/ink" xmlns:am3d="http://schemas.microsoft.com/office/drawing/2017/model3d" xmlns:o="urn:schemas-microsoft-com:office:office" xmlns:r="http://schemas.openxmlformats.org/officeDocument/2006/relationships" xmlns:m="http://schemas.openxmlformats.org/officeDocument/2006/math" xmlns:v="urn:schemas-microsoft-com:vml" xmlns:wp14="http://schemas.microsoft.com/office/word/2010/wordprocessingDrawing" xmlns:wp="http://schemas.openxmlformats.org/drawingml/2006/wordprocessingDrawing" xmlns:w10="urn:schemas-microsoft-com:office:word" xmlns:w="http://schemas.openxmlformats.org/wordprocessingml/2006/main" xmlns:w14="http://schemas.microsoft.com/office/word/2010/wordml" xmlns:w15="http://schemas.microsoft.com/office/word/2012/wordml" xmlns:w16cid="http://schemas.microsoft.com/office/word/2016/wordml/cid" xmlns:w16se="http://schemas.microsoft.com/office/word/2015/wordml/symex" xmlns:wpg="http://schemas.microsoft.com/office/word/2010/wordprocessingGroup" xmlns:wpi="http://schemas.microsoft.com/office/word/2010/wordprocessingInk" xmlns:wne="http://schemas.microsoft.com/office/word/2006/wordml" xmlns:wps="http://schemas.microsoft.com/office/word/2010/wordprocessingShape" mc:Ignorable="w14 w15 w16se w16cid wp14">
+<w:ftr xmlns:wpc="http://schemas.microsoft.com/office/word/2010/wordprocessingCanvas" xmlns:cx="http://schemas.microsoft.com/office/drawing/2014/chartex" xmlns:cx1="http://schemas.microsoft.com/office/drawing/2015/9/8/chartex" xmlns:cx2="http://schemas.microsoft.com/office/drawing/2015/10/21/chartex" xmlns:cx3="http://schemas.microsoft.com/office/drawing/2016/5/9/chartex" xmlns:cx4="http://schemas.microsoft.com/office/drawing/2016/5/10/chartex" xmlns:cx5="http://schemas.microsoft.com/office/drawing/2016/5/11/chartex" xmlns:cx6="http://schemas.microsoft.com/office/drawing/2016/5/12/chartex" xmlns:cx7="http://schemas.microsoft.com/office/drawing/2016/5/13/chartex" xmlns:cx8="http://schemas.microsoft.com/office/drawing/2016/5/14/chartex" xmlns:mc="http://schemas.openxmlformats.org/markup-compatibility/2006" xmlns:aink="http://schemas.microsoft.com/office/drawing/2016/ink" xmlns:am3d="http://schemas.microsoft.com/office/drawing/2017/model3d" xmlns:o="urn:schemas-microsoft-com:office:office" xmlns:oel="http://schemas.microsoft.com/office/2019/extlst" xmlns:r="http://schemas.openxmlformats.org/officeDocument/2006/relationships" xmlns:m="http://schemas.openxmlformats.org/officeDocument/2006/math" xmlns:v="urn:schemas-microsoft-com:vml" xmlns:wp14="http://schemas.microsoft.com/office/word/2010/wordprocessingDrawing" xmlns:wp="http://schemas.openxmlformats.org/drawingml/2006/wordprocessingDrawing" xmlns:w10="urn:schemas-microsoft-com:office:word" xmlns:w="http://schemas.openxmlformats.org/wordprocessingml/2006/main" xmlns:w14="http://schemas.microsoft.com/office/word/2010/wordml" xmlns:w15="http://schemas.microsoft.com/office/word/2012/wordml" xmlns:w16cex="http://schemas.microsoft.com/office/word/2018/wordml/cex" xmlns:w16cid="http://schemas.microsoft.com/office/word/2016/wordml/cid" xmlns:w16="http://schemas.microsoft.com/office/word/2018/wordml" xmlns:w16du="http://schemas.microsoft.com/office/word/2023/wordml/word16du" xmlns:w16sdtdh="http://schemas.microsoft.com/office/word/2020/wordml/sdtdatahash" xmlns:w16sdtfl="http://schemas.microsoft.com/office/word/2024/wordml/sdtformatlock" xmlns:w16se="http://schemas.microsoft.com/office/word/2015/wordml/symex" xmlns:wpg="http://schemas.microsoft.com/office/word/2010/wordprocessingGroup" xmlns:wpi="http://schemas.microsoft.com/office/word/2010/wordprocessingInk" xmlns:wne="http://schemas.microsoft.com/office/word/2006/wordml" xmlns:wps="http://schemas.microsoft.com/office/word/2010/wordprocessingShape" mc:Ignorable="w14 w15 w16se w16cid w16 w16cex w16sdtdh w16sdtfl w16du wp14">
   <w:sdt>
     <w:sdtPr>
       <w:id w:val="-1767219425"/>
@@ -5561,7 +5547,7 @@
 </file>
 
 <file path=word/footer2.xml><?xml version="1.0" encoding="utf-8"?>
-<w:ftr xmlns:wpc="http://schemas.microsoft.com/office/word/2010/wordprocessingCanvas" xmlns:cx="http://schemas.microsoft.com/office/drawing/2014/chartex" xmlns:cx1="http://schemas.microsoft.com/office/drawing/2015/9/8/chartex" xmlns:cx2="http://schemas.microsoft.com/office/drawing/2015/10/21/chartex" xmlns:cx3="http://schemas.microsoft.com/office/drawing/2016/5/9/chartex" xmlns:cx4="http://schemas.microsoft.com/office/drawing/2016/5/10/chartex" xmlns:cx5="http://schemas.microsoft.com/office/drawing/2016/5/11/chartex" xmlns:cx6="http://schemas.microsoft.com/office/drawing/2016/5/12/chartex" xmlns:cx7="http://schemas.microsoft.com/office/drawing/2016/5/13/chartex" xmlns:cx8="http://schemas.microsoft.com/office/drawing/2016/5/14/chartex" xmlns:mc="http://schemas.openxmlformats.org/markup-compatibility/2006" xmlns:aink="http://schemas.microsoft.com/office/drawing/2016/ink" xmlns:am3d="http://schemas.microsoft.com/office/drawing/2017/model3d" xmlns:o="urn:schemas-microsoft-com:office:office" xmlns:r="http://schemas.openxmlformats.org/officeDocument/2006/relationships" xmlns:m="http://schemas.openxmlformats.org/officeDocument/2006/math" xmlns:v="urn:schemas-microsoft-com:vml" xmlns:wp14="http://schemas.microsoft.com/office/word/2010/wordprocessingDrawing" xmlns:wp="http://schemas.openxmlformats.org/drawingml/2006/wordprocessingDrawing" xmlns:w10="urn:schemas-microsoft-com:office:word" xmlns:w="http://schemas.openxmlformats.org/wordprocessingml/2006/main" xmlns:w14="http://schemas.microsoft.com/office/word/2010/wordml" xmlns:w15="http://schemas.microsoft.com/office/word/2012/wordml" xmlns:w16cid="http://schemas.microsoft.com/office/word/2016/wordml/cid" xmlns:w16se="http://schemas.microsoft.com/office/word/2015/wordml/symex" xmlns:wpg="http://schemas.microsoft.com/office/word/2010/wordprocessingGroup" xmlns:wpi="http://schemas.microsoft.com/office/word/2010/wordprocessingInk" xmlns:wne="http://schemas.microsoft.com/office/word/2006/wordml" xmlns:wps="http://schemas.microsoft.com/office/word/2010/wordprocessingShape" mc:Ignorable="w14 w15 w16se w16cid wp14">
+<w:ftr xmlns:wpc="http://schemas.microsoft.com/office/word/2010/wordprocessingCanvas" xmlns:cx="http://schemas.microsoft.com/office/drawing/2014/chartex" xmlns:cx1="http://schemas.microsoft.com/office/drawing/2015/9/8/chartex" xmlns:cx2="http://schemas.microsoft.com/office/drawing/2015/10/21/chartex" xmlns:cx3="http://schemas.microsoft.com/office/drawing/2016/5/9/chartex" xmlns:cx4="http://schemas.microsoft.com/office/drawing/2016/5/10/chartex" xmlns:cx5="http://schemas.microsoft.com/office/drawing/2016/5/11/chartex" xmlns:cx6="http://schemas.microsoft.com/office/drawing/2016/5/12/chartex" xmlns:cx7="http://schemas.microsoft.com/office/drawing/2016/5/13/chartex" xmlns:cx8="http://schemas.microsoft.com/office/drawing/2016/5/14/chartex" xmlns:mc="http://schemas.openxmlformats.org/markup-compatibility/2006" xmlns:aink="http://schemas.microsoft.com/office/drawing/2016/ink" xmlns:am3d="http://schemas.microsoft.com/office/drawing/2017/model3d" xmlns:o="urn:schemas-microsoft-com:office:office" xmlns:oel="http://schemas.microsoft.com/office/2019/extlst" xmlns:r="http://schemas.openxmlformats.org/officeDocument/2006/relationships" xmlns:m="http://schemas.openxmlformats.org/officeDocument/2006/math" xmlns:v="urn:schemas-microsoft-com:vml" xmlns:wp14="http://schemas.microsoft.com/office/word/2010/wordprocessingDrawing" xmlns:wp="http://schemas.openxmlformats.org/drawingml/2006/wordprocessingDrawing" xmlns:w10="urn:schemas-microsoft-com:office:word" xmlns:w="http://schemas.openxmlformats.org/wordprocessingml/2006/main" xmlns:w14="http://schemas.microsoft.com/office/word/2010/wordml" xmlns:w15="http://schemas.microsoft.com/office/word/2012/wordml" xmlns:w16cex="http://schemas.microsoft.com/office/word/2018/wordml/cex" xmlns:w16cid="http://schemas.microsoft.com/office/word/2016/wordml/cid" xmlns:w16="http://schemas.microsoft.com/office/word/2018/wordml" xmlns:w16du="http://schemas.microsoft.com/office/word/2023/wordml/word16du" xmlns:w16sdtdh="http://schemas.microsoft.com/office/word/2020/wordml/sdtdatahash" xmlns:w16sdtfl="http://schemas.microsoft.com/office/word/2024/wordml/sdtformatlock" xmlns:w16se="http://schemas.microsoft.com/office/word/2015/wordml/symex" xmlns:wpg="http://schemas.microsoft.com/office/word/2010/wordprocessingGroup" xmlns:wpi="http://schemas.microsoft.com/office/word/2010/wordprocessingInk" xmlns:wne="http://schemas.microsoft.com/office/word/2006/wordml" xmlns:wps="http://schemas.microsoft.com/office/word/2010/wordprocessingShape" mc:Ignorable="w14 w15 w16se w16cid w16 w16cex w16sdtdh w16sdtfl w16du wp14">
   <w:sdt>
     <w:sdtPr>
       <w:id w:val="-383260592"/>
@@ -5614,7 +5600,7 @@
 </file>
 
 <file path=word/footnotes.xml><?xml version="1.0" encoding="utf-8"?>
-<w:footnotes xmlns:wpc="http://schemas.microsoft.com/office/word/2010/wordprocessingCanvas" xmlns:cx="http://schemas.microsoft.com/office/drawing/2014/chartex" xmlns:cx1="http://schemas.microsoft.com/office/drawing/2015/9/8/chartex" xmlns:cx2="http://schemas.microsoft.com/office/drawing/2015/10/21/chartex" xmlns:cx3="http://schemas.microsoft.com/office/drawing/2016/5/9/chartex" xmlns:cx4="http://schemas.microsoft.com/office/drawing/2016/5/10/chartex" xmlns:cx5="http://schemas.microsoft.com/office/drawing/2016/5/11/chartex" xmlns:cx6="http://schemas.microsoft.com/office/drawing/2016/5/12/chartex" xmlns:cx7="http://schemas.microsoft.com/office/drawing/2016/5/13/chartex" xmlns:cx8="http://schemas.microsoft.com/office/drawing/2016/5/14/chartex" xmlns:mc="http://schemas.openxmlformats.org/markup-compatibility/2006" xmlns:aink="http://schemas.microsoft.com/office/drawing/2016/ink" xmlns:am3d="http://schemas.microsoft.com/office/drawing/2017/model3d" xmlns:o="urn:schemas-microsoft-com:office:office" xmlns:r="http://schemas.openxmlformats.org/officeDocument/2006/relationships" xmlns:m="http://schemas.openxmlformats.org/officeDocument/2006/math" xmlns:v="urn:schemas-microsoft-com:vml" xmlns:wp14="http://schemas.microsoft.com/office/word/2010/wordprocessingDrawing" xmlns:wp="http://schemas.openxmlformats.org/drawingml/2006/wordprocessingDrawing" xmlns:w10="urn:schemas-microsoft-com:office:word" xmlns:w="http://schemas.openxmlformats.org/wordprocessingml/2006/main" xmlns:w14="http://schemas.microsoft.com/office/word/2010/wordml" xmlns:w15="http://schemas.microsoft.com/office/word/2012/wordml" xmlns:w16cid="http://schemas.microsoft.com/office/word/2016/wordml/cid" xmlns:w16se="http://schemas.microsoft.com/office/word/2015/wordml/symex" xmlns:wpg="http://schemas.microsoft.com/office/word/2010/wordprocessingGroup" xmlns:wpi="http://schemas.microsoft.com/office/word/2010/wordprocessingInk" xmlns:wne="http://schemas.microsoft.com/office/word/2006/wordml" xmlns:wps="http://schemas.microsoft.com/office/word/2010/wordprocessingShape" mc:Ignorable="w14 w15 w16se w16cid wp14">
+<w:footnotes xmlns:wpc="http://schemas.microsoft.com/office/word/2010/wordprocessingCanvas" xmlns:cx="http://schemas.microsoft.com/office/drawing/2014/chartex" xmlns:cx1="http://schemas.microsoft.com/office/drawing/2015/9/8/chartex" xmlns:cx2="http://schemas.microsoft.com/office/drawing/2015/10/21/chartex" xmlns:cx3="http://schemas.microsoft.com/office/drawing/2016/5/9/chartex" xmlns:cx4="http://schemas.microsoft.com/office/drawing/2016/5/10/chartex" xmlns:cx5="http://schemas.microsoft.com/office/drawing/2016/5/11/chartex" xmlns:cx6="http://schemas.microsoft.com/office/drawing/2016/5/12/chartex" xmlns:cx7="http://schemas.microsoft.com/office/drawing/2016/5/13/chartex" xmlns:cx8="http://schemas.microsoft.com/office/drawing/2016/5/14/chartex" xmlns:mc="http://schemas.openxmlformats.org/markup-compatibility/2006" xmlns:aink="http://schemas.microsoft.com/office/drawing/2016/ink" xmlns:am3d="http://schemas.microsoft.com/office/drawing/2017/model3d" xmlns:o="urn:schemas-microsoft-com:office:office" xmlns:oel="http://schemas.microsoft.com/office/2019/extlst" xmlns:r="http://schemas.openxmlformats.org/officeDocument/2006/relationships" xmlns:m="http://schemas.openxmlformats.org/officeDocument/2006/math" xmlns:v="urn:schemas-microsoft-com:vml" xmlns:wp14="http://schemas.microsoft.com/office/word/2010/wordprocessingDrawing" xmlns:wp="http://schemas.openxmlformats.org/drawingml/2006/wordprocessingDrawing" xmlns:w10="urn:schemas-microsoft-com:office:word" xmlns:w="http://schemas.openxmlformats.org/wordprocessingml/2006/main" xmlns:w14="http://schemas.microsoft.com/office/word/2010/wordml" xmlns:w15="http://schemas.microsoft.com/office/word/2012/wordml" xmlns:w16cex="http://schemas.microsoft.com/office/word/2018/wordml/cex" xmlns:w16cid="http://schemas.microsoft.com/office/word/2016/wordml/cid" xmlns:w16="http://schemas.microsoft.com/office/word/2018/wordml" xmlns:w16du="http://schemas.microsoft.com/office/word/2023/wordml/word16du" xmlns:w16sdtdh="http://schemas.microsoft.com/office/word/2020/wordml/sdtdatahash" xmlns:w16sdtfl="http://schemas.microsoft.com/office/word/2024/wordml/sdtformatlock" xmlns:w16se="http://schemas.microsoft.com/office/word/2015/wordml/symex" xmlns:wpg="http://schemas.microsoft.com/office/word/2010/wordprocessingGroup" xmlns:wpi="http://schemas.microsoft.com/office/word/2010/wordprocessingInk" xmlns:wne="http://schemas.microsoft.com/office/word/2006/wordml" xmlns:wps="http://schemas.microsoft.com/office/word/2010/wordprocessingShape" mc:Ignorable="w14 w15 w16se w16cid w16 w16cex w16sdtdh w16sdtfl w16du wp14">
   <w:footnote w:type="separator" w:id="-1">
     <w:p>
       <w:r>
@@ -5633,7 +5619,7 @@
 </file>
 
 <file path=word/numbering.xml><?xml version="1.0" encoding="utf-8"?>
-<w:numbering xmlns:wpc="http://schemas.microsoft.com/office/word/2010/wordprocessingCanvas" xmlns:cx="http://schemas.microsoft.com/office/drawing/2014/chartex" xmlns:cx1="http://schemas.microsoft.com/office/drawing/2015/9/8/chartex" xmlns:cx2="http://schemas.microsoft.com/office/drawing/2015/10/21/chartex" xmlns:cx3="http://schemas.microsoft.com/office/drawing/2016/5/9/chartex" xmlns:cx4="http://schemas.microsoft.com/office/drawing/2016/5/10/chartex" xmlns:cx5="http://schemas.microsoft.com/office/drawing/2016/5/11/chartex" xmlns:cx6="http://schemas.microsoft.com/office/drawing/2016/5/12/chartex" xmlns:cx7="http://schemas.microsoft.com/office/drawing/2016/5/13/chartex" xmlns:cx8="http://schemas.microsoft.com/office/drawing/2016/5/14/chartex" xmlns:mc="http://schemas.openxmlformats.org/markup-compatibility/2006" xmlns:aink="http://schemas.microsoft.com/office/drawing/2016/ink" xmlns:am3d="http://schemas.microsoft.com/office/drawing/2017/model3d" xmlns:o="urn:schemas-microsoft-com:office:office" xmlns:r="http://schemas.openxmlformats.org/officeDocument/2006/relationships" xmlns:m="http://schemas.openxmlformats.org/officeDocument/2006/math" xmlns:v="urn:schemas-microsoft-com:vml" xmlns:wp14="http://schemas.microsoft.com/office/word/2010/wordprocessingDrawing" xmlns:wp="http://schemas.openxmlformats.org/drawingml/2006/wordprocessingDrawing" xmlns:w10="urn:schemas-microsoft-com:office:word" xmlns:w="http://schemas.openxmlformats.org/wordprocessingml/2006/main" xmlns:w14="http://schemas.microsoft.com/office/word/2010/wordml" xmlns:w15="http://schemas.microsoft.com/office/word/2012/wordml" xmlns:w16cid="http://schemas.microsoft.com/office/word/2016/wordml/cid" xmlns:w16se="http://schemas.microsoft.com/office/word/2015/wordml/symex" xmlns:wpg="http://schemas.microsoft.com/office/word/2010/wordprocessingGroup" xmlns:wpi="http://schemas.microsoft.com/office/word/2010/wordprocessingInk" xmlns:wne="http://schemas.microsoft.com/office/word/2006/wordml" xmlns:wps="http://schemas.microsoft.com/office/word/2010/wordprocessingShape" mc:Ignorable="w14 w15 w16se w16cid wp14">
+<w:numbering xmlns:wpc="http://schemas.microsoft.com/office/word/2010/wordprocessingCanvas" xmlns:cx="http://schemas.microsoft.com/office/drawing/2014/chartex" xmlns:cx1="http://schemas.microsoft.com/office/drawing/2015/9/8/chartex" xmlns:cx2="http://schemas.microsoft.com/office/drawing/2015/10/21/chartex" xmlns:cx3="http://schemas.microsoft.com/office/drawing/2016/5/9/chartex" xmlns:cx4="http://schemas.microsoft.com/office/drawing/2016/5/10/chartex" xmlns:cx5="http://schemas.microsoft.com/office/drawing/2016/5/11/chartex" xmlns:cx6="http://schemas.microsoft.com/office/drawing/2016/5/12/chartex" xmlns:cx7="http://schemas.microsoft.com/office/drawing/2016/5/13/chartex" xmlns:cx8="http://schemas.microsoft.com/office/drawing/2016/5/14/chartex" xmlns:mc="http://schemas.openxmlformats.org/markup-compatibility/2006" xmlns:aink="http://schemas.microsoft.com/office/drawing/2016/ink" xmlns:am3d="http://schemas.microsoft.com/office/drawing/2017/model3d" xmlns:o="urn:schemas-microsoft-com:office:office" xmlns:oel="http://schemas.microsoft.com/office/2019/extlst" xmlns:r="http://schemas.openxmlformats.org/officeDocument/2006/relationships" xmlns:m="http://schemas.openxmlformats.org/officeDocument/2006/math" xmlns:v="urn:schemas-microsoft-com:vml" xmlns:wp14="http://schemas.microsoft.com/office/word/2010/wordprocessingDrawing" xmlns:wp="http://schemas.openxmlformats.org/drawingml/2006/wordprocessingDrawing" xmlns:w10="urn:schemas-microsoft-com:office:word" xmlns:w="http://schemas.openxmlformats.org/wordprocessingml/2006/main" xmlns:w14="http://schemas.microsoft.com/office/word/2010/wordml" xmlns:w15="http://schemas.microsoft.com/office/word/2012/wordml" xmlns:w16cex="http://schemas.microsoft.com/office/word/2018/wordml/cex" xmlns:w16cid="http://schemas.microsoft.com/office/word/2016/wordml/cid" xmlns:w16="http://schemas.microsoft.com/office/word/2018/wordml" xmlns:w16du="http://schemas.microsoft.com/office/word/2023/wordml/word16du" xmlns:w16sdtdh="http://schemas.microsoft.com/office/word/2020/wordml/sdtdatahash" xmlns:w16sdtfl="http://schemas.microsoft.com/office/word/2024/wordml/sdtformatlock" xmlns:w16se="http://schemas.microsoft.com/office/word/2015/wordml/symex" xmlns:wpg="http://schemas.microsoft.com/office/word/2010/wordprocessingGroup" xmlns:wpi="http://schemas.microsoft.com/office/word/2010/wordprocessingInk" xmlns:wne="http://schemas.microsoft.com/office/word/2006/wordml" xmlns:wps="http://schemas.microsoft.com/office/word/2010/wordprocessingShape" mc:Ignorable="w14 w15 w16se w16cid w16 w16cex w16sdtdh w16sdtfl w16du wp14">
   <w:abstractNum w:abstractNumId="0" w15:restartNumberingAfterBreak="0">
     <w:nsid w:val="04F9736E"/>
     <w:multiLevelType w:val="hybridMultilevel"/>
@@ -6624,38 +6610,38 @@
       </w:rPr>
     </w:lvl>
   </w:abstractNum>
-  <w:num w:numId="1">
+  <w:num w:numId="1" w16cid:durableId="1840195114">
     <w:abstractNumId w:val="4"/>
   </w:num>
-  <w:num w:numId="2">
+  <w:num w:numId="2" w16cid:durableId="1334337635">
     <w:abstractNumId w:val="2"/>
   </w:num>
-  <w:num w:numId="3">
+  <w:num w:numId="3" w16cid:durableId="1422481941">
     <w:abstractNumId w:val="8"/>
   </w:num>
-  <w:num w:numId="4">
+  <w:num w:numId="4" w16cid:durableId="745735468">
     <w:abstractNumId w:val="7"/>
   </w:num>
-  <w:num w:numId="5">
+  <w:num w:numId="5" w16cid:durableId="1608151383">
     <w:abstractNumId w:val="1"/>
   </w:num>
-  <w:num w:numId="6">
+  <w:num w:numId="6" w16cid:durableId="1818112861">
     <w:abstractNumId w:val="3"/>
   </w:num>
-  <w:num w:numId="7">
+  <w:num w:numId="7" w16cid:durableId="694772628">
     <w:abstractNumId w:val="5"/>
   </w:num>
-  <w:num w:numId="8">
+  <w:num w:numId="8" w16cid:durableId="2099978427">
     <w:abstractNumId w:val="0"/>
   </w:num>
-  <w:num w:numId="9">
+  <w:num w:numId="9" w16cid:durableId="19287449">
     <w:abstractNumId w:val="6"/>
   </w:num>
 </w:numbering>
 </file>
 
 <file path=word/styles.xml><?xml version="1.0" encoding="utf-8"?>
-<w:styles xmlns:mc="http://schemas.openxmlformats.org/markup-compatibility/2006" xmlns:r="http://schemas.openxmlformats.org/officeDocument/2006/relationships" xmlns:w="http://schemas.openxmlformats.org/wordprocessingml/2006/main" xmlns:w14="http://schemas.microsoft.com/office/word/2010/wordml" xmlns:w15="http://schemas.microsoft.com/office/word/2012/wordml" xmlns:w16cid="http://schemas.microsoft.com/office/word/2016/wordml/cid" xmlns:w16se="http://schemas.microsoft.com/office/word/2015/wordml/symex" mc:Ignorable="w14 w15 w16se w16cid">
+<w:styles xmlns:mc="http://schemas.openxmlformats.org/markup-compatibility/2006" xmlns:r="http://schemas.openxmlformats.org/officeDocument/2006/relationships" xmlns:w="http://schemas.openxmlformats.org/wordprocessingml/2006/main" xmlns:w14="http://schemas.microsoft.com/office/word/2010/wordml" xmlns:w15="http://schemas.microsoft.com/office/word/2012/wordml" xmlns:w16cex="http://schemas.microsoft.com/office/word/2018/wordml/cex" xmlns:w16cid="http://schemas.microsoft.com/office/word/2016/wordml/cid" xmlns:w16="http://schemas.microsoft.com/office/word/2018/wordml" xmlns:w16du="http://schemas.microsoft.com/office/word/2023/wordml/word16du" xmlns:w16sdtdh="http://schemas.microsoft.com/office/word/2020/wordml/sdtdatahash" xmlns:w16sdtfl="http://schemas.microsoft.com/office/word/2024/wordml/sdtformatlock" xmlns:w16se="http://schemas.microsoft.com/office/word/2015/wordml/symex" mc:Ignorable="w14 w15 w16se w16cid w16 w16cex w16sdtdh w16sdtfl w16du">
   <w:docDefaults>
     <w:rPrDefault>
       <w:rPr>
@@ -6667,7 +6653,7 @@
     </w:rPrDefault>
     <w:pPrDefault/>
   </w:docDefaults>
-  <w:latentStyles w:defLockedState="0" w:defUIPriority="99" w:defSemiHidden="0" w:defUnhideWhenUsed="0" w:defQFormat="0" w:count="375">
+  <w:latentStyles w:defLockedState="0" w:defUIPriority="99" w:defSemiHidden="0" w:defUnhideWhenUsed="0" w:defQFormat="0" w:count="376">
     <w:lsdException w:name="Normal" w:uiPriority="0" w:qFormat="1"/>
     <w:lsdException w:name="heading 1" w:uiPriority="9" w:qFormat="1"/>
     <w:lsdException w:name="heading 2" w:semiHidden="1" w:uiPriority="9" w:unhideWhenUsed="1" w:qFormat="1"/>
@@ -7043,6 +7029,7 @@
     <w:lsdException w:name="Smart Hyperlink" w:semiHidden="1" w:unhideWhenUsed="1"/>
     <w:lsdException w:name="Hashtag" w:semiHidden="1" w:unhideWhenUsed="1"/>
     <w:lsdException w:name="Unresolved Mention" w:semiHidden="1" w:unhideWhenUsed="1"/>
+    <w:lsdException w:name="Smart Link" w:semiHidden="1" w:unhideWhenUsed="1"/>
   </w:latentStyles>
   <w:style w:type="paragraph" w:default="1" w:styleId="Normal">
     <w:name w:val="Normal"/>

</xml_diff>